<commit_message>
Update lab materials and assignments for BIO 462/594: - Revise README for OSC Classroom login and lab settings. - Modify Lab 1 PreLab Handout for clarity and consistency. - Adjust Lab 1 Report Assignment Rubric for formatting and content. - Enhance Lab 2 PreLab Handout with updated instructions and terminology. - Revise Lab 2 Report Assignment Rubric for clarity and consistency. - Update Lab 3 PreLab Handout with improved explanations and formatting. - Revise Lab 3 Writeup Assignment Rubric for clarity and consistency.
</commit_message>
<xml_diff>
--- a/lab1_variant_interpretation/Lab1_PreLab_Handout.docx
+++ b/lab1_variant_interpretation/Lab1_PreLab_Handout.docx
@@ -9,7 +9,7 @@
           <w:color w:val="0279EE"/>
           <w:sz w:val="32"/>
         </w:rPr>
-        <w:t>Pre-Lab 1 — Getting Your Brain Ready for Variant Interpretation</w:t>
+        <w:t>Pre-Lab 1  -  Getting Your Brain Ready for Variant Interpretation</w:t>
       </w:r>
     </w:p>
     <w:p>
@@ -37,7 +37,7 @@
           <w:b w:val="0"/>
           <w:i w:val="0"/>
         </w:rPr>
-        <w:t>Sequencing a human genome is now cheap and fast. The hard part is not reading the sequence — it is deciding what the thousands of differences mean. On Tuesday you will use AlphaMissense, a deep-learning model from Google DeepMind (Science, 2023) that has scored every possible missense substitution in the human proteome. You will compare its scores against ClinVar, the public archive of what clinical laboratories actually assert about variants they have seen in patients. Then you will apply the ACMG rules that clinical geneticists use to turn evidence into a classification.</w:t>
+        <w:t>Sequencing a human genome is now cheap and fast. The hard part is not reading the sequence  -  it is deciding what the thousands of differences mean. On Tuesday you will use AlphaMissense, a deep-learning model from Google DeepMind (Science, 2023) that has scored every possible missense substitution in the human proteome. You will compare its scores against ClinVar, the public archive of what clinical laboratories actually assert about variants they have seen in patients. Then you will apply the ACMG rules that clinical geneticists use to turn evidence into a classification.</w:t>
       </w:r>
     </w:p>
     <w:p>
@@ -46,7 +46,7 @@
           <w:b w:val="0"/>
           <w:i w:val="0"/>
         </w:rPr>
-        <w:t>Our three genes — TP53, BRCA1, and RPS19 — all cause inherited disease, but in completely different ways. The same tool and the same rules produce three completely different variant landscapes. Understanding why is the point of the lab.</w:t>
+        <w:t>Our three genes  -  TP53, BRCA1, and RPS19  -  all cause inherited disease, but in completely different ways. The same tool and the same rules produce three completely different variant landscapes. Understanding why is the point of the lab.</w:t>
       </w:r>
     </w:p>
     <w:p>
@@ -136,7 +136,7 @@
           </w:tcPr>
           <w:p>
             <w:r>
-              <w:t>A model's number from 0 to 1 for how likely a variant is to be damaging. 0.98 is not a probability of disease — it is a ranking against all other variants.</w:t>
+              <w:t>A model's number from 0 to 1 for how likely a variant is to be damaging. 0.98 is not a probability of disease  -  it is a ranking against all other variants.</w:t>
             </w:r>
           </w:p>
         </w:tc>
@@ -180,7 +180,7 @@
           </w:tcPr>
           <w:p>
             <w:r>
-              <w:t>Variant of Uncertain Significance — the evidence is not good enough to call it either way. Most rare missense variants are VUS.</w:t>
+              <w:t>Variant of Uncertain Significance  -  the evidence is not good enough to call it either way. Most rare missense variants are VUS.</w:t>
             </w:r>
           </w:p>
         </w:tc>
@@ -237,7 +237,7 @@
           <w:color w:val="0279EE"/>
           <w:sz w:val="25"/>
         </w:rPr>
-        <w:t>Self-check — try these before class (answers below)</w:t>
+        <w:t>Self-check  -  try these before class (answers below)</w:t>
       </w:r>
     </w:p>
     <w:p>
@@ -302,7 +302,7 @@
         <w:pStyle w:val="ListBullet"/>
       </w:pPr>
       <w:r>
-        <w:t>Proteins have small numbers of precisely placed critical residues — DNA-contacting arginines, zinc-coordinating cysteines, splice-site-adjacent residues. Swapping those breaks the whole fold or function, not just one contact.</w:t>
+        <w:t>Proteins have small numbers of precisely placed critical residues  -  DNA-contacting arginines, zinc-coordinating cysteines, splice-site-adjacent residues. Swapping those breaks the whole fold or function, not just one contact.</w:t>
       </w:r>
     </w:p>
     <w:p>
@@ -342,7 +342,7 @@
         <w:pStyle w:val="ListBullet"/>
       </w:pPr>
       <w:r>
-        <w:t>Loss of heterozygosity (LOH). One inherited damaged copy plus loss of the normal copy removes all functional TP53 — the classic two-hit requirement for tumor suppressors.</w:t>
+        <w:t>Loss of heterozygosity (LOH). One inherited damaged copy plus loss of the normal copy removes all functional TP53  -  the classic two-hit requirement for tumor suppressors.</w:t>
       </w:r>
     </w:p>
     <w:p>
@@ -380,7 +380,7 @@
           <w:b w:val="0"/>
           <w:i w:val="0"/>
         </w:rPr>
-        <w:t>A browser and your UD login — everything else runs on the Ohio Supercomputer Center through your web browser. The session is a 75-minute hands-on lab: you will open a Jupyter notebook, run provided code, and fill in short answers. No coding background is needed or assumed. The Variant Interpretation Report (30% of the lab portfolio) will be assigned at the end of the session and is due Tuesday, October 13.</w:t>
+        <w:t>A browser and your UD login  -  everything else runs on the Ohio Supercomputer Center through your web browser. The session is a 75-minute hands-on lab: you will open a Jupyter notebook, run provided code, and fill in short answers. No coding background is needed or assumed. The Variant Interpretation Report (30% of the lab portfolio) will be assigned at the end of the session and is due Tuesday, October 13.</w:t>
       </w:r>
     </w:p>
     <w:p>
@@ -389,10 +389,16 @@
           <w:b w:val="0"/>
           <w:i w:val="0"/>
         </w:rPr>
-        <w:t>First step in class (we will do this together): copy your own working copy of the lab so your edits and outputs do not collide with classmates:  cp -r /fs/ess/PNS0503/Mol_Bio_comp_labs/lab1_variant_interpretation  ~/lab1  — then always open YOUR copy (~/lab1/Lab1_Student.ipynb), never the shared original.</w:t>
+        <w:t>First step in class (we will do this together): copy your own working copy of the lab so your edits and outputs do not collide with classmates:  cp -r /fs/ess/PNS0503/Mol_Bio_comp_labs/lab1_variant_interpretation  ~/lab1   -  then always open YOUR copy (~/lab1/Lab1_Student.ipynb), never the shared original.</w:t>
       </w:r>
     </w:p>
     <w:sectPr>
+      <w:headerReference w:type="default" r:id="rId9"/>
+      <w:footerReference w:type="default" r:id="rId10"/>
+      <w:headerReference w:type="first" r:id="rId11"/>
+      <w:footerReference w:type="first" r:id="rId12"/>
+      <w:headerReference w:type="even" r:id="rId13"/>
+      <w:footerReference w:type="even" r:id="rId14"/>
       <w:pgSz w:w="12240" w:h="15840"/>
       <w:pgMar w:top="1440" w:right="1800" w:bottom="1440" w:left="1800" w:header="720" w:footer="720" w:gutter="0"/>
       <w:cols w:space="720"/>
@@ -400,6 +406,66 @@
     </w:sectPr>
   </w:body>
 </w:document>
+</file>
+
+<file path=word/footer1.xml><?xml version="1.0" encoding="utf-8"?>
+<w:ftr xmlns:m="http://schemas.openxmlformats.org/officeDocument/2006/math" xmlns:mc="http://schemas.openxmlformats.org/markup-compatibility/2006" xmlns:mo="http://schemas.microsoft.com/office/mac/office/2008/main" xmlns:mv="urn:schemas-microsoft-com:mac:vml" xmlns:o="urn:schemas-microsoft-com:office:office" xmlns:r="http://schemas.openxmlformats.org/officeDocument/2006/relationships" xmlns:v="urn:schemas-microsoft-com:vml" xmlns:w10="urn:schemas-microsoft-com:office:word" xmlns:w14="http://schemas.microsoft.com/office/word/2010/wordml" xmlns:w="http://schemas.openxmlformats.org/wordprocessingml/2006/main" xmlns:wne="http://schemas.microsoft.com/office/word/2006/wordml" xmlns:wp14="http://schemas.microsoft.com/office/word/2010/wordprocessingDrawing" xmlns:wp="http://schemas.openxmlformats.org/drawingml/2006/wordprocessingDrawing" xmlns:wpc="http://schemas.microsoft.com/office/word/2010/wordprocessingCanvas" xmlns:wpg="http://schemas.microsoft.com/office/word/2010/wordprocessingGroup" xmlns:wpi="http://schemas.microsoft.com/office/word/2010/wordprocessingInk" xmlns:wps="http://schemas.microsoft.com/office/word/2010/wordprocessingShape" mc:Ignorable="w14 wp14">
+  <w:p>
+    <w:pPr>
+      <w:pStyle w:val="Footer"/>
+    </w:pPr>
+  </w:p>
+</w:ftr>
+</file>
+
+<file path=word/footer2.xml><?xml version="1.0" encoding="utf-8"?>
+<w:ftr xmlns:m="http://schemas.openxmlformats.org/officeDocument/2006/math" xmlns:mc="http://schemas.openxmlformats.org/markup-compatibility/2006" xmlns:mo="http://schemas.microsoft.com/office/mac/office/2008/main" xmlns:mv="urn:schemas-microsoft-com:mac:vml" xmlns:o="urn:schemas-microsoft-com:office:office" xmlns:r="http://schemas.openxmlformats.org/officeDocument/2006/relationships" xmlns:v="urn:schemas-microsoft-com:vml" xmlns:w10="urn:schemas-microsoft-com:office:word" xmlns:w14="http://schemas.microsoft.com/office/word/2010/wordml" xmlns:w="http://schemas.openxmlformats.org/wordprocessingml/2006/main" xmlns:wne="http://schemas.microsoft.com/office/word/2006/wordml" xmlns:wp14="http://schemas.microsoft.com/office/word/2010/wordprocessingDrawing" xmlns:wp="http://schemas.openxmlformats.org/drawingml/2006/wordprocessingDrawing" xmlns:wpc="http://schemas.microsoft.com/office/word/2010/wordprocessingCanvas" xmlns:wpg="http://schemas.microsoft.com/office/word/2010/wordprocessingGroup" xmlns:wpi="http://schemas.microsoft.com/office/word/2010/wordprocessingInk" xmlns:wps="http://schemas.microsoft.com/office/word/2010/wordprocessingShape" mc:Ignorable="w14 wp14">
+  <w:p>
+    <w:pPr>
+      <w:pStyle w:val="Footer"/>
+    </w:pPr>
+  </w:p>
+</w:ftr>
+</file>
+
+<file path=word/footer3.xml><?xml version="1.0" encoding="utf-8"?>
+<w:ftr xmlns:m="http://schemas.openxmlformats.org/officeDocument/2006/math" xmlns:mc="http://schemas.openxmlformats.org/markup-compatibility/2006" xmlns:mo="http://schemas.microsoft.com/office/mac/office/2008/main" xmlns:mv="urn:schemas-microsoft-com:mac:vml" xmlns:o="urn:schemas-microsoft-com:office:office" xmlns:r="http://schemas.openxmlformats.org/officeDocument/2006/relationships" xmlns:v="urn:schemas-microsoft-com:vml" xmlns:w10="urn:schemas-microsoft-com:office:word" xmlns:w14="http://schemas.microsoft.com/office/word/2010/wordml" xmlns:w="http://schemas.openxmlformats.org/wordprocessingml/2006/main" xmlns:wne="http://schemas.microsoft.com/office/word/2006/wordml" xmlns:wp14="http://schemas.microsoft.com/office/word/2010/wordprocessingDrawing" xmlns:wp="http://schemas.openxmlformats.org/drawingml/2006/wordprocessingDrawing" xmlns:wpc="http://schemas.microsoft.com/office/word/2010/wordprocessingCanvas" xmlns:wpg="http://schemas.microsoft.com/office/word/2010/wordprocessingGroup" xmlns:wpi="http://schemas.microsoft.com/office/word/2010/wordprocessingInk" xmlns:wps="http://schemas.microsoft.com/office/word/2010/wordprocessingShape" mc:Ignorable="w14 wp14">
+  <w:p>
+    <w:pPr>
+      <w:pStyle w:val="Footer"/>
+    </w:pPr>
+  </w:p>
+</w:ftr>
+</file>
+
+<file path=word/header1.xml><?xml version="1.0" encoding="utf-8"?>
+<w:hdr xmlns:m="http://schemas.openxmlformats.org/officeDocument/2006/math" xmlns:mc="http://schemas.openxmlformats.org/markup-compatibility/2006" xmlns:mo="http://schemas.microsoft.com/office/mac/office/2008/main" xmlns:mv="urn:schemas-microsoft-com:mac:vml" xmlns:o="urn:schemas-microsoft-com:office:office" xmlns:r="http://schemas.openxmlformats.org/officeDocument/2006/relationships" xmlns:v="urn:schemas-microsoft-com:vml" xmlns:w10="urn:schemas-microsoft-com:office:word" xmlns:w14="http://schemas.microsoft.com/office/word/2010/wordml" xmlns:w="http://schemas.openxmlformats.org/wordprocessingml/2006/main" xmlns:wne="http://schemas.microsoft.com/office/word/2006/wordml" xmlns:wp14="http://schemas.microsoft.com/office/word/2010/wordprocessingDrawing" xmlns:wp="http://schemas.openxmlformats.org/drawingml/2006/wordprocessingDrawing" xmlns:wpc="http://schemas.microsoft.com/office/word/2010/wordprocessingCanvas" xmlns:wpg="http://schemas.microsoft.com/office/word/2010/wordprocessingGroup" xmlns:wpi="http://schemas.microsoft.com/office/word/2010/wordprocessingInk" xmlns:wps="http://schemas.microsoft.com/office/word/2010/wordprocessingShape" mc:Ignorable="w14 wp14">
+  <w:p>
+    <w:pPr>
+      <w:pStyle w:val="Header"/>
+    </w:pPr>
+  </w:p>
+</w:hdr>
+</file>
+
+<file path=word/header2.xml><?xml version="1.0" encoding="utf-8"?>
+<w:hdr xmlns:m="http://schemas.openxmlformats.org/officeDocument/2006/math" xmlns:mc="http://schemas.openxmlformats.org/markup-compatibility/2006" xmlns:mo="http://schemas.microsoft.com/office/mac/office/2008/main" xmlns:mv="urn:schemas-microsoft-com:mac:vml" xmlns:o="urn:schemas-microsoft-com:office:office" xmlns:r="http://schemas.openxmlformats.org/officeDocument/2006/relationships" xmlns:v="urn:schemas-microsoft-com:vml" xmlns:w10="urn:schemas-microsoft-com:office:word" xmlns:w14="http://schemas.microsoft.com/office/word/2010/wordml" xmlns:w="http://schemas.openxmlformats.org/wordprocessingml/2006/main" xmlns:wne="http://schemas.microsoft.com/office/word/2006/wordml" xmlns:wp14="http://schemas.microsoft.com/office/word/2010/wordprocessingDrawing" xmlns:wp="http://schemas.openxmlformats.org/drawingml/2006/wordprocessingDrawing" xmlns:wpc="http://schemas.microsoft.com/office/word/2010/wordprocessingCanvas" xmlns:wpg="http://schemas.microsoft.com/office/word/2010/wordprocessingGroup" xmlns:wpi="http://schemas.microsoft.com/office/word/2010/wordprocessingInk" xmlns:wps="http://schemas.microsoft.com/office/word/2010/wordprocessingShape" mc:Ignorable="w14 wp14">
+  <w:p>
+    <w:pPr>
+      <w:pStyle w:val="Header"/>
+    </w:pPr>
+  </w:p>
+</w:hdr>
+</file>
+
+<file path=word/header3.xml><?xml version="1.0" encoding="utf-8"?>
+<w:hdr xmlns:m="http://schemas.openxmlformats.org/officeDocument/2006/math" xmlns:mc="http://schemas.openxmlformats.org/markup-compatibility/2006" xmlns:mo="http://schemas.microsoft.com/office/mac/office/2008/main" xmlns:mv="urn:schemas-microsoft-com:mac:vml" xmlns:o="urn:schemas-microsoft-com:office:office" xmlns:r="http://schemas.openxmlformats.org/officeDocument/2006/relationships" xmlns:v="urn:schemas-microsoft-com:vml" xmlns:w10="urn:schemas-microsoft-com:office:word" xmlns:w14="http://schemas.microsoft.com/office/word/2010/wordml" xmlns:w="http://schemas.openxmlformats.org/wordprocessingml/2006/main" xmlns:wne="http://schemas.microsoft.com/office/word/2006/wordml" xmlns:wp14="http://schemas.microsoft.com/office/word/2010/wordprocessingDrawing" xmlns:wp="http://schemas.openxmlformats.org/drawingml/2006/wordprocessingDrawing" xmlns:wpc="http://schemas.microsoft.com/office/word/2010/wordprocessingCanvas" xmlns:wpg="http://schemas.microsoft.com/office/word/2010/wordprocessingGroup" xmlns:wpi="http://schemas.microsoft.com/office/word/2010/wordprocessingInk" xmlns:wps="http://schemas.microsoft.com/office/word/2010/wordprocessingShape" mc:Ignorable="w14 wp14">
+  <w:p>
+    <w:pPr>
+      <w:pStyle w:val="Header"/>
+    </w:pPr>
+  </w:p>
+</w:hdr>
 </file>
 
 <file path=word/numbering.xml><?xml version="1.0" encoding="utf-8"?>

</xml_diff>

<commit_message>
Update Lab 1 Pre-Lab Handout to include ClinVar hyperlink and improve clarity
</commit_message>
<xml_diff>
--- a/lab1_variant_interpretation/Lab1_PreLab_Handout.docx
+++ b/lab1_variant_interpretation/Lab1_PreLab_Handout.docx
@@ -102,28 +102,7 @@
         </w:rPr>
       </w:pPr>
       <w:r>
-        <w:t xml:space="preserve">The </w:t>
-      </w:r>
-      <w:r>
-        <w:t>three genes</w:t>
-      </w:r>
-      <w:r>
-        <w:t xml:space="preserve"> we will investigate – </w:t>
-      </w:r>
-      <w:r>
-        <w:t>TP53, BRCA1, and RPS19</w:t>
-      </w:r>
-      <w:r>
-        <w:t xml:space="preserve"> – </w:t>
-      </w:r>
-      <w:r>
-        <w:t xml:space="preserve">all cause inherited disease, but in </w:t>
-      </w:r>
-      <w:r>
-        <w:t>significantly</w:t>
-      </w:r>
-      <w:r>
-        <w:t xml:space="preserve"> different ways. The same tool and the same rules produce three completely different variant landscapes. Understanding why is the point of the lab.</w:t>
+        <w:t>The three genes we will investigate – TP53, BRCA1, and RPS19 – all cause inherited disease, but in significantly different ways. The same tool and the same rules produce three completely different variant landscapes. Understanding why is the point of the lab.</w:t>
       </w:r>
     </w:p>
     <w:p>
@@ -430,6 +409,7 @@
     <w:p>
       <w:pPr>
         <w:rPr>
+          <w:rFonts w:hint="eastAsia"/>
           <w:b/>
           <w:color w:val="0279EE"/>
           <w:sz w:val="25"/>
@@ -439,6 +419,7 @@
     <w:p>
       <w:pPr>
         <w:rPr>
+          <w:rFonts w:hint="eastAsia"/>
           <w:b/>
           <w:color w:val="0279EE"/>
           <w:sz w:val="25"/>
@@ -653,7 +634,51 @@
         </w:rPr>
       </w:pPr>
       <w:r>
-        <w:t>Go to clinvar.ncbi.nlm.nih.gov and search for "12374" (that is the ClinVar ID for TP53 R175H). Find: (a) the star rating / review status, (b) at least three conditions listed, (c) the "Assertion criteria" link if present. You will meet this variant again on Tuesday.</w:t>
+        <w:t xml:space="preserve">Go to </w:t>
+      </w:r>
+      <w:r>
+        <w:t xml:space="preserve">the </w:t>
+      </w:r>
+      <w:hyperlink r:id="rId8" w:tgtFrame="_blank" w:history="1">
+        <w:proofErr w:type="spellStart"/>
+        <w:r>
+          <w:rPr>
+            <w:rStyle w:val="Hyperlink"/>
+          </w:rPr>
+          <w:t>ClinV</w:t>
+        </w:r>
+        <w:r>
+          <w:rPr>
+            <w:rStyle w:val="Hyperlink"/>
+          </w:rPr>
+          <w:t>a</w:t>
+        </w:r>
+        <w:r>
+          <w:rPr>
+            <w:rStyle w:val="Hyperlink"/>
+          </w:rPr>
+          <w:t>r</w:t>
+        </w:r>
+        <w:proofErr w:type="spellEnd"/>
+      </w:hyperlink>
+      <w:hyperlink r:id="rId9" w:tgtFrame="_blank" w:history="1"/>
+      <w:r>
+        <w:t xml:space="preserve"> </w:t>
+      </w:r>
+      <w:r>
+        <w:rPr>
+          <w:rFonts w:hint="eastAsia"/>
+        </w:rPr>
+        <w:t>W</w:t>
+      </w:r>
+      <w:r>
+        <w:t>ebsite</w:t>
+      </w:r>
+      <w:r>
+        <w:t xml:space="preserve"> </w:t>
+      </w:r>
+      <w:r>
+        <w:t>and search for "12374" (that is the ClinVar ID for TP53 R175H). Find: (a) the star rating / review status, (b) at least three conditions listed, (c) the "Assertion criteria" link if present. You will meet this variant again on Tuesday.</w:t>
       </w:r>
     </w:p>
     <w:p>
@@ -672,6 +697,11 @@
       </w:r>
     </w:p>
     <w:p>
+      <w:pPr>
+        <w:rPr>
+          <w:rFonts w:hint="eastAsia"/>
+        </w:rPr>
+      </w:pPr>
       <w:r>
         <w:t>A browser and your UD login  -  everything else runs on the Ohio Supercomputer Center through your web browser. The session is a 75-minute hands-on lab: you will open a Jupyter notebook, run provided code, and fill in short answers. No coding background is needed or assumed. The Variant Interpretation Report (30% of the lab portfolio) will be assigned at the end of the session and is due Tuesday, October 13.</w:t>
       </w:r>
@@ -709,20 +739,22 @@
       </w:r>
     </w:p>
     <w:p>
+      <w:pPr>
+        <w:rPr>
+          <w:rFonts w:hint="eastAsia"/>
+        </w:rPr>
+      </w:pPr>
       <w:r>
-        <w:t>A</w:t>
+        <w:t>All comp labs for BIO 462/594 will use the material found in the GitHub Repository:</w:t>
       </w:r>
-      <w:r>
-        <w:t xml:space="preserve">ll comp labs for BIO 462/594 will use the material found in the GitHub </w:t>
-      </w:r>
-      <w:proofErr w:type="spellStart"/>
-      <w:r>
-        <w:t>Repository:</w:t>
-      </w:r>
-      <w:proofErr w:type="spellEnd"/>
     </w:p>
     <w:p>
-      <w:hyperlink r:id="rId8" w:history="1">
+      <w:pPr>
+        <w:rPr>
+          <w:rFonts w:hint="eastAsia"/>
+        </w:rPr>
+      </w:pPr>
+      <w:hyperlink r:id="rId10" w:history="1">
         <w:r>
           <w:rPr>
             <w:rStyle w:val="Hyperlink"/>
@@ -732,6 +764,11 @@
       </w:hyperlink>
     </w:p>
     <w:p>
+      <w:pPr>
+        <w:rPr>
+          <w:rFonts w:hint="eastAsia"/>
+        </w:rPr>
+      </w:pPr>
       <w:r>
         <w:t>For those of us biologists who may not have dabbled in computational stuff, GitHub is just a website</w:t>
       </w:r>
@@ -766,6 +803,11 @@
       </w:r>
     </w:p>
     <w:p>
+      <w:pPr>
+        <w:rPr>
+          <w:rFonts w:hint="eastAsia"/>
+        </w:rPr>
+      </w:pPr>
       <w:r>
         <w:rPr>
           <w:b/>
@@ -786,6 +828,11 @@
       </w:r>
     </w:p>
     <w:p>
+      <w:pPr>
+        <w:rPr>
+          <w:rFonts w:hint="eastAsia"/>
+        </w:rPr>
+      </w:pPr>
       <w:r>
         <w:rPr>
           <w:b/>
@@ -802,7 +849,7 @@
       <w:r>
         <w:t xml:space="preserve">boot camp YouTube video for those interested in learning python: </w:t>
       </w:r>
-      <w:hyperlink r:id="rId9" w:history="1">
+      <w:hyperlink r:id="rId11" w:history="1">
         <w:r>
           <w:rPr>
             <w:rStyle w:val="Hyperlink"/>
@@ -824,6 +871,11 @@
       </w:r>
     </w:p>
     <w:p>
+      <w:pPr>
+        <w:rPr>
+          <w:rFonts w:hint="eastAsia"/>
+        </w:rPr>
+      </w:pPr>
       <w:r>
         <w:rPr>
           <w:b/>
@@ -852,6 +904,11 @@
       </w:r>
     </w:p>
     <w:p>
+      <w:pPr>
+        <w:rPr>
+          <w:rFonts w:hint="eastAsia"/>
+        </w:rPr>
+      </w:pPr>
       <w:r>
         <w:rPr>
           <w:b/>
@@ -903,12 +960,12 @@
       </w:r>
     </w:p>
     <w:sectPr>
-      <w:headerReference w:type="even" r:id="rId10"/>
-      <w:headerReference w:type="default" r:id="rId11"/>
-      <w:footerReference w:type="even" r:id="rId12"/>
-      <w:footerReference w:type="default" r:id="rId13"/>
-      <w:headerReference w:type="first" r:id="rId14"/>
-      <w:footerReference w:type="first" r:id="rId15"/>
+      <w:headerReference w:type="even" r:id="rId12"/>
+      <w:headerReference w:type="default" r:id="rId13"/>
+      <w:footerReference w:type="even" r:id="rId14"/>
+      <w:footerReference w:type="default" r:id="rId15"/>
+      <w:headerReference w:type="first" r:id="rId16"/>
+      <w:footerReference w:type="first" r:id="rId17"/>
       <w:pgSz w:w="12240" w:h="15840"/>
       <w:pgMar w:top="1440" w:right="1800" w:bottom="1440" w:left="1800" w:header="720" w:footer="720" w:gutter="0"/>
       <w:cols w:space="720"/>
@@ -1195,7 +1252,7 @@
   <w:abstractNum w:abstractNumId="7" w15:restartNumberingAfterBreak="0">
     <w:nsid w:val="FFFFFF88"/>
     <w:multiLevelType w:val="singleLevel"/>
-    <w:tmpl w:val="D0A62B40"/>
+    <w:tmpl w:val="2CC4A83A"/>
     <w:lvl w:ilvl="0">
       <w:start w:val="1"/>
       <w:numFmt w:val="decimal"/>
@@ -1213,7 +1270,7 @@
   <w:abstractNum w:abstractNumId="8" w15:restartNumberingAfterBreak="0">
     <w:nsid w:val="FFFFFF89"/>
     <w:multiLevelType w:val="singleLevel"/>
-    <w:tmpl w:val="29761A62"/>
+    <w:tmpl w:val="A75E4A44"/>
     <w:lvl w:ilvl="0">
       <w:start w:val="1"/>
       <w:numFmt w:val="bullet"/>
@@ -1257,6 +1314,9 @@
   </w:num>
   <w:num w:numId="9" w16cid:durableId="1533377770">
     <w:abstractNumId w:val="0"/>
+  </w:num>
+  <w:num w:numId="10" w16cid:durableId="1443305016">
+    <w:abstractNumId w:val="7"/>
   </w:num>
 </w:numbering>
 </file>
@@ -1868,7 +1928,6 @@
   <w:style w:type="character" w:default="1" w:styleId="DefaultParagraphFont">
     <w:name w:val="Default Paragraph Font"/>
     <w:uiPriority w:val="1"/>
-    <w:semiHidden/>
     <w:unhideWhenUsed/>
   </w:style>
   <w:style w:type="table" w:default="1" w:styleId="TableNormal">
@@ -12666,6 +12725,18 @@
     <w:rPr>
       <w:color w:val="605E5C"/>
       <w:shd w:val="clear" w:color="auto" w:fill="E1DFDD"/>
+    </w:rPr>
+  </w:style>
+  <w:style w:type="character" w:styleId="FollowedHyperlink">
+    <w:name w:val="FollowedHyperlink"/>
+    <w:basedOn w:val="DefaultParagraphFont"/>
+    <w:uiPriority w:val="99"/>
+    <w:semiHidden/>
+    <w:unhideWhenUsed/>
+    <w:rsid w:val="00487F69"/>
+    <w:rPr>
+      <w:color w:val="800080" w:themeColor="followedHyperlink"/>
+      <w:u w:val="single"/>
     </w:rPr>
   </w:style>
 </w:styles>

</xml_diff>